<commit_message>
Offer template: allergies without deadline
Co-Authored-By: Claude Opus 5.5 <noreply@anthropic.com>
Claude-Session: https://claude.ai/code/session_01BpCPjtkQ5YXMdKLNokz4mv
</commit_message>
<xml_diff>
--- a/.claude/context/omonia/Vorlage_Gruppenangebot_Omonia.docx
+++ b/.claude/context/omonia/Vorlage_Gruppenangebot_Omonia.docx
@@ -837,20 +837,7 @@
           <w:rFonts w:asciiTheme="minorBidi" w:hAnsiTheme="minorBidi"/>
         </w:rPr>
         <w:br/>
-        <w:t xml:space="preserve">Allergien und Unverträglichkeiten teilen Sie uns bitte spätestens </w:t>
-      </w:r>
-      <w:r>
-        <w:rPr>
-          <w:rFonts w:asciiTheme="minorBidi" w:hAnsiTheme="minorBidi"/>
-          <w:highlight w:val="yellow"/>
-        </w:rPr>
-        <w:t xml:space="preserve">[3 Tage]</w:t>
-      </w:r>
-      <w:r>
-        <w:rPr>
-          <w:rFonts w:asciiTheme="minorBidi" w:hAnsiTheme="minorBidi"/>
-        </w:rPr>
-        <w:t xml:space="preserve"> vor der Veranstaltung mit.</w:t>
+        <w:t xml:space="preserve">Bitte teilen Sie uns Allergien und Unverträglichkeiten vorab mit.</w:t>
       </w:r>
       <w:r>
         <w:rPr>

</xml_diff>